<commit_message>
Update portfolio: education redesign, testimonials, footer, CV, mobile fix
- Remove rotating "Available for Work" stamp from hero section
- Redesign education cards to match site style (clean white, champagne top border)
- Merge Aliki Mitropoulou's two testimonials into one; add Viktoria Kalogera testimonial
- Update footer location from Lille to Athens, Greece
- Replace CV file with updated version
- Fix featured work section mobile responsiveness: restore proper padding and grid layout on small screens; stack Challenge/Result boxes vertically on mobile
</commit_message>
<xml_diff>
--- a/assets/Nefeli_Tsaousi_CV.docx
+++ b/assets/Nefeli_Tsaousi_CV.docx
@@ -1,6 +1,6 @@
 
 <file path=word/document.xml><?xml version="1.0" encoding="utf-8"?>
-<w:document xmlns:wpc="http://schemas.microsoft.com/office/word/2010/wordprocessingCanvas" xmlns:cx="http://schemas.microsoft.com/office/drawing/2014/chartex" xmlns:cx1="http://schemas.microsoft.com/office/drawing/2015/9/8/chartex" xmlns:cx2="http://schemas.microsoft.com/office/drawing/2015/10/21/chartex" xmlns:cx3="http://schemas.microsoft.com/office/drawing/2016/5/9/chartex" xmlns:cx4="http://schemas.microsoft.com/office/drawing/2016/5/10/chartex" xmlns:cx5="http://schemas.microsoft.com/office/drawing/2016/5/11/chartex" xmlns:cx6="http://schemas.microsoft.com/office/drawing/2016/5/12/chartex" xmlns:cx7="http://schemas.microsoft.com/office/drawing/2016/5/13/chartex" xmlns:cx8="http://schemas.microsoft.com/office/drawing/2016/5/14/chartex" xmlns:mc="http://schemas.openxmlformats.org/markup-compatibility/2006" xmlns:aink="http://schemas.microsoft.com/office/drawing/2016/ink" xmlns:am3d="http://schemas.microsoft.com/office/drawing/2017/model3d" xmlns:o="urn:schemas-microsoft-com:office:office" xmlns:oel="http://schemas.microsoft.com/office/2019/extlst" xmlns:r="http://schemas.openxmlformats.org/officeDocument/2006/relationships" xmlns:m="http://schemas.openxmlformats.org/officeDocument/2006/math" xmlns:v="urn:schemas-microsoft-com:vml" xmlns:wp14="http://schemas.microsoft.com/office/word/2010/wordprocessingDrawing" xmlns:wp="http://schemas.openxmlformats.org/drawingml/2006/wordprocessingDrawing" xmlns:w10="urn:schemas-microsoft-com:office:word" xmlns:w="http://schemas.openxmlformats.org/wordprocessingml/2006/main" xmlns:w14="http://schemas.microsoft.com/office/word/2010/wordml" xmlns:w15="http://schemas.microsoft.com/office/word/2012/wordml" xmlns:w16cex="http://schemas.microsoft.com/office/word/2018/wordml/cex" xmlns:w16cid="http://schemas.microsoft.com/office/word/2016/wordml/cid" xmlns:w16="http://schemas.microsoft.com/office/word/2018/wordml" xmlns:w16du="http://schemas.microsoft.com/office/word/2023/wordml/word16du" xmlns:w16sdtdh="http://schemas.microsoft.com/office/word/2020/wordml/sdtdatahash" xmlns:w16sdtfl="http://schemas.microsoft.com/office/word/2024/wordml/sdtformatlock" xmlns:w16se="http://schemas.microsoft.com/office/word/2015/wordml/symex" xmlns:wpg="http://schemas.microsoft.com/office/word/2010/wordprocessingGroup" xmlns:wpi="http://schemas.microsoft.com/office/word/2010/wordprocessingInk" xmlns:wne="http://schemas.microsoft.com/office/word/2006/wordml" xmlns:wps="http://schemas.microsoft.com/office/word/2010/wordprocessingShape" mc:Ignorable="w14 w15 w16se w16cid w16 w16cex w16sdtdh w16sdtfl w16du wp14">
+<w:document xmlns:wpc="http://schemas.microsoft.com/office/word/2010/wordprocessingCanvas" xmlns:cx="http://schemas.microsoft.com/office/drawing/2014/chartex" xmlns:cx1="http://schemas.microsoft.com/office/drawing/2015/9/8/chartex" xmlns:cx2="http://schemas.microsoft.com/office/drawing/2015/10/21/chartex" xmlns:cx3="http://schemas.microsoft.com/office/drawing/2016/5/9/chartex" xmlns:cx4="http://schemas.microsoft.com/office/drawing/2016/5/10/chartex" xmlns:cx5="http://schemas.microsoft.com/office/drawing/2016/5/11/chartex" xmlns:cx6="http://schemas.microsoft.com/office/drawing/2016/5/12/chartex" xmlns:cx7="http://schemas.microsoft.com/office/drawing/2016/5/13/chartex" xmlns:cx8="http://schemas.microsoft.com/office/drawing/2016/5/14/chartex" xmlns:mc="http://schemas.openxmlformats.org/markup-compatibility/2006" xmlns:m="http://schemas.openxmlformats.org/officeDocument/2006/math" xmlns:aink="http://schemas.microsoft.com/office/drawing/2016/ink" xmlns:am3d="http://schemas.microsoft.com/office/drawing/2017/model3d" xmlns:oel="http://schemas.microsoft.com/office/2019/extlst" xmlns:r="http://schemas.openxmlformats.org/officeDocument/2006/relationships" xmlns:wp14="http://schemas.microsoft.com/office/word/2010/wordprocessingDrawing" xmlns:wp="http://schemas.openxmlformats.org/drawingml/2006/wordprocessingDrawing" xmlns:wpg="http://schemas.microsoft.com/office/word/2010/wordprocessingGroup" xmlns:wpi="http://schemas.microsoft.com/office/word/2010/wordprocessingInk" xmlns:wps="http://schemas.microsoft.com/office/word/2010/wordprocessingShape" xmlns:o="urn:schemas-microsoft-com:office:office" xmlns:v="urn:schemas-microsoft-com:vml" xmlns:w10="urn:schemas-microsoft-com:office:word" xmlns:w="http://schemas.openxmlformats.org/wordprocessingml/2006/main" xmlns:w14="http://schemas.microsoft.com/office/word/2010/wordml" xmlns:w15="http://schemas.microsoft.com/office/word/2012/wordml" xmlns:w16cex="http://schemas.microsoft.com/office/word/2018/wordml/cex" xmlns:w16cid="http://schemas.microsoft.com/office/word/2016/wordml/cid" xmlns:w16="http://schemas.microsoft.com/office/word/2018/wordml" xmlns:w16sdtdh="http://schemas.microsoft.com/office/word/2020/wordml/sdtdatahash" xmlns:w16sdtfl="http://schemas.microsoft.com/office/word/2024/wordml/sdtformatlock" xmlns:w16se="http://schemas.microsoft.com/office/word/2015/wordml/symex" xmlns:w16du="http://schemas.microsoft.com/office/word/2023/wordml/word16du" xmlns:wne="http://schemas.microsoft.com/office/word/2006/wordml" mc:Ignorable="w14 w15 w16se w16cid w16 w16cex w16sdtdh w16sdtfl w16du wp14">
   <w:body>
     <w:p>
       <w:pPr>
@@ -32,16 +32,68 @@
           <w:rFonts w:ascii="Arial" w:eastAsia="Arial" w:hAnsi="Arial" w:cs="Arial"/>
           <w:sz w:val="22"/>
           <w:szCs w:val="22"/>
-        </w:rPr>
-        <w:t>Lille, France – Open to Europe</w:t>
-      </w:r>
-      <w:r>
-        <w:rPr>
-          <w:rFonts w:ascii="Arial" w:eastAsia="Arial" w:hAnsi="Arial" w:cs="Arial"/>
-          <w:sz w:val="22"/>
-          <w:szCs w:val="22"/>
-        </w:rPr>
-        <w:t xml:space="preserve">|  +33 757147964  |  nefeli@tsaousis.net  |  </w:t>
+          <w:lang w:val="en-US"/>
+        </w:rPr>
+        <w:t>Athens</w:t>
+      </w:r>
+      <w:r>
+        <w:rPr>
+          <w:rFonts w:ascii="Arial" w:eastAsia="Arial" w:hAnsi="Arial" w:cs="Arial"/>
+          <w:sz w:val="22"/>
+          <w:szCs w:val="22"/>
+        </w:rPr>
+        <w:t xml:space="preserve">, </w:t>
+      </w:r>
+      <w:r>
+        <w:rPr>
+          <w:rFonts w:ascii="Arial" w:eastAsia="Arial" w:hAnsi="Arial" w:cs="Arial"/>
+          <w:sz w:val="22"/>
+          <w:szCs w:val="22"/>
+          <w:lang w:val="en-US"/>
+        </w:rPr>
+        <w:t>Greece</w:t>
+      </w:r>
+      <w:r>
+        <w:rPr>
+          <w:rFonts w:ascii="Arial" w:eastAsia="Arial" w:hAnsi="Arial" w:cs="Arial"/>
+          <w:sz w:val="22"/>
+          <w:szCs w:val="22"/>
+        </w:rPr>
+        <w:t xml:space="preserve"> </w:t>
+      </w:r>
+      <w:r>
+        <w:rPr>
+          <w:rFonts w:ascii="Arial" w:eastAsia="Arial" w:hAnsi="Arial" w:cs="Arial"/>
+          <w:sz w:val="22"/>
+          <w:szCs w:val="22"/>
+          <w:lang w:val="en-US"/>
+        </w:rPr>
+        <w:t xml:space="preserve"> </w:t>
+      </w:r>
+      <w:r>
+        <w:rPr>
+          <w:rFonts w:ascii="Arial" w:eastAsia="Arial" w:hAnsi="Arial" w:cs="Arial"/>
+          <w:sz w:val="22"/>
+          <w:szCs w:val="22"/>
+        </w:rPr>
+        <w:t>|  +</w:t>
+      </w:r>
+      <w:r>
+        <w:rPr>
+          <w:rFonts w:ascii="Arial" w:eastAsia="Arial" w:hAnsi="Arial" w:cs="Arial"/>
+          <w:sz w:val="22"/>
+          <w:szCs w:val="22"/>
+          <w:lang w:val="en-US"/>
+        </w:rPr>
+        <w:t>30 6945625590</w:t>
+      </w:r>
+      <w:r>
+        <w:rPr>
+          <w:rFonts w:ascii="Arial" w:eastAsia="Arial" w:hAnsi="Arial" w:cs="Arial"/>
+          <w:sz w:val="22"/>
+          <w:szCs w:val="22"/>
+        </w:rPr>
+        <w:t xml:space="preserve">  |  nefeli@tsaousis.net  |  </w:t>
       </w:r>
     </w:p>
     <w:p>
@@ -85,8 +137,17 @@
           <w:rFonts w:ascii="Arial" w:eastAsia="Arial" w:hAnsi="Arial" w:cs="Arial"/>
           <w:sz w:val="22"/>
           <w:szCs w:val="22"/>
-        </w:rPr>
-        <w:t>Master’s student in Digital Marketing and Customer Experience Management at IESEG School of Management, graduating in June 2026. Digital marketing professional with hands-on experience across paid media, event marketing, social media management, and content creation in technology, beauty, retail, and higher education. Proven track record of delivering measurable results from growing social accounts to 60K followers in 3 months and supporting campaigns that drove 400+ daily trial sign-ups, to managing email campaigns achieving 20% open rates and 10% CTR.</w:t>
+          <w:lang w:val="en-US"/>
+        </w:rPr>
+        <w:t xml:space="preserve">Graduate </w:t>
+      </w:r>
+      <w:r>
+        <w:rPr>
+          <w:rFonts w:ascii="Arial" w:eastAsia="Arial" w:hAnsi="Arial" w:cs="Arial"/>
+          <w:sz w:val="22"/>
+          <w:szCs w:val="22"/>
+        </w:rPr>
+        <w:t>Master student in Digital Marketing and Customer Experience Management at IESEG School of Management. Digital marketing professional with hands-on experience across paid media, event marketing, social media management, and content creation in technology, beauty, retail, and higher education. Proven track record of delivering measurable results from growing social accounts to 60K followers in 3 months and supporting campaigns that drove 400+ daily trial sign-ups, to managing email campaigns achieving 20% open rates and 10% CTR.</w:t>
       </w:r>
     </w:p>
     <w:p>
@@ -691,13 +752,18 @@
       </w:r>
     </w:p>
     <w:p>
-      <w:r>
-        <w:rPr>
-          <w:rFonts w:ascii="Arial" w:eastAsia="Arial" w:hAnsi="Arial" w:cs="Arial"/>
-          <w:sz w:val="22"/>
-          <w:szCs w:val="22"/>
-        </w:rPr>
-        <w:t>MSc, Digital Marketing and Customer Experience Management  |  IESEG School of Management  |  Graduation: Jun 2026</w:t>
+      <w:pPr>
+        <w:rPr>
+          <w:lang w:val="en-US"/>
+        </w:rPr>
+      </w:pPr>
+      <w:r>
+        <w:rPr>
+          <w:rFonts w:ascii="Arial" w:eastAsia="Arial" w:hAnsi="Arial" w:cs="Arial"/>
+          <w:sz w:val="22"/>
+          <w:szCs w:val="22"/>
+        </w:rPr>
+        <w:t xml:space="preserve">MSc, Digital Marketing and Customer Experience Management  |  IESEG School of Management </w:t>
       </w:r>
     </w:p>
     <w:p>
@@ -748,17 +814,17 @@
           <w:sz w:val="22"/>
           <w:szCs w:val="22"/>
         </w:rPr>
+        <w:t>Participant, L’Oréal Brandstorm  |  2026</w:t>
+      </w:r>
+    </w:p>
+    <w:p>
+      <w:r>
+        <w:rPr>
+          <w:rFonts w:ascii="Arial" w:eastAsia="Arial" w:hAnsi="Arial" w:cs="Arial"/>
+          <w:sz w:val="22"/>
+          <w:szCs w:val="22"/>
+        </w:rPr>
         <w:t>Winner, Best 3-Year Marketing Plan, Deree Capstone Project  |  2025</w:t>
-      </w:r>
-    </w:p>
-    <w:p>
-      <w:r>
-        <w:rPr>
-          <w:rFonts w:ascii="Arial" w:eastAsia="Arial" w:hAnsi="Arial" w:cs="Arial"/>
-          <w:sz w:val="22"/>
-          <w:szCs w:val="22"/>
-        </w:rPr>
-        <w:t>Participant, L’Oréal Brandstorm  |  2026</w:t>
       </w:r>
     </w:p>
     <w:p>
@@ -844,7 +910,7 @@
           <w:sz w:val="22"/>
           <w:szCs w:val="22"/>
         </w:rPr>
-        <w:t>Greek (Native)  |  English (Fluent)  |  French (B2 in progress)</w:t>
+        <w:t>Greek (Native)  |  English (Fluent)  |  French (B2)</w:t>
       </w:r>
     </w:p>
     <w:sectPr>
@@ -858,7 +924,7 @@
 </file>
 
 <file path=word/numbering.xml><?xml version="1.0" encoding="utf-8"?>
-<w:numbering xmlns:wpc="http://schemas.microsoft.com/office/word/2010/wordprocessingCanvas" xmlns:cx="http://schemas.microsoft.com/office/drawing/2014/chartex" xmlns:cx1="http://schemas.microsoft.com/office/drawing/2015/9/8/chartex" xmlns:cx2="http://schemas.microsoft.com/office/drawing/2015/10/21/chartex" xmlns:cx3="http://schemas.microsoft.com/office/drawing/2016/5/9/chartex" xmlns:cx4="http://schemas.microsoft.com/office/drawing/2016/5/10/chartex" xmlns:cx5="http://schemas.microsoft.com/office/drawing/2016/5/11/chartex" xmlns:cx6="http://schemas.microsoft.com/office/drawing/2016/5/12/chartex" xmlns:cx7="http://schemas.microsoft.com/office/drawing/2016/5/13/chartex" xmlns:cx8="http://schemas.microsoft.com/office/drawing/2016/5/14/chartex" xmlns:mc="http://schemas.openxmlformats.org/markup-compatibility/2006" xmlns:aink="http://schemas.microsoft.com/office/drawing/2016/ink" xmlns:am3d="http://schemas.microsoft.com/office/drawing/2017/model3d" xmlns:o="urn:schemas-microsoft-com:office:office" xmlns:oel="http://schemas.microsoft.com/office/2019/extlst" xmlns:r="http://schemas.openxmlformats.org/officeDocument/2006/relationships" xmlns:m="http://schemas.openxmlformats.org/officeDocument/2006/math" xmlns:v="urn:schemas-microsoft-com:vml" xmlns:wp14="http://schemas.microsoft.com/office/word/2010/wordprocessingDrawing" xmlns:wp="http://schemas.openxmlformats.org/drawingml/2006/wordprocessingDrawing" xmlns:w10="urn:schemas-microsoft-com:office:word" xmlns:w="http://schemas.openxmlformats.org/wordprocessingml/2006/main" xmlns:w14="http://schemas.microsoft.com/office/word/2010/wordml" xmlns:w15="http://schemas.microsoft.com/office/word/2012/wordml" xmlns:w16cex="http://schemas.microsoft.com/office/word/2018/wordml/cex" xmlns:w16cid="http://schemas.microsoft.com/office/word/2016/wordml/cid" xmlns:w16="http://schemas.microsoft.com/office/word/2018/wordml" xmlns:w16du="http://schemas.microsoft.com/office/word/2023/wordml/word16du" xmlns:w16sdtdh="http://schemas.microsoft.com/office/word/2020/wordml/sdtdatahash" xmlns:w16sdtfl="http://schemas.microsoft.com/office/word/2024/wordml/sdtformatlock" xmlns:w16se="http://schemas.microsoft.com/office/word/2015/wordml/symex" xmlns:wpg="http://schemas.microsoft.com/office/word/2010/wordprocessingGroup" xmlns:wpi="http://schemas.microsoft.com/office/word/2010/wordprocessingInk" xmlns:wne="http://schemas.microsoft.com/office/word/2006/wordml" xmlns:wps="http://schemas.microsoft.com/office/word/2010/wordprocessingShape" mc:Ignorable="w14 w15 w16se w16cid w16 w16cex w16sdtdh w16sdtfl w16du wp14">
+<w:numbering xmlns:wpc="http://schemas.microsoft.com/office/word/2010/wordprocessingCanvas" xmlns:cx="http://schemas.microsoft.com/office/drawing/2014/chartex" xmlns:cx1="http://schemas.microsoft.com/office/drawing/2015/9/8/chartex" xmlns:cx2="http://schemas.microsoft.com/office/drawing/2015/10/21/chartex" xmlns:cx3="http://schemas.microsoft.com/office/drawing/2016/5/9/chartex" xmlns:cx4="http://schemas.microsoft.com/office/drawing/2016/5/10/chartex" xmlns:cx5="http://schemas.microsoft.com/office/drawing/2016/5/11/chartex" xmlns:cx6="http://schemas.microsoft.com/office/drawing/2016/5/12/chartex" xmlns:cx7="http://schemas.microsoft.com/office/drawing/2016/5/13/chartex" xmlns:cx8="http://schemas.microsoft.com/office/drawing/2016/5/14/chartex" xmlns:mc="http://schemas.openxmlformats.org/markup-compatibility/2006" xmlns:m="http://schemas.openxmlformats.org/officeDocument/2006/math" xmlns:aink="http://schemas.microsoft.com/office/drawing/2016/ink" xmlns:am3d="http://schemas.microsoft.com/office/drawing/2017/model3d" xmlns:oel="http://schemas.microsoft.com/office/2019/extlst" xmlns:r="http://schemas.openxmlformats.org/officeDocument/2006/relationships" xmlns:wp14="http://schemas.microsoft.com/office/word/2010/wordprocessingDrawing" xmlns:wp="http://schemas.openxmlformats.org/drawingml/2006/wordprocessingDrawing" xmlns:wpg="http://schemas.microsoft.com/office/word/2010/wordprocessingGroup" xmlns:wpi="http://schemas.microsoft.com/office/word/2010/wordprocessingInk" xmlns:wps="http://schemas.microsoft.com/office/word/2010/wordprocessingShape" xmlns:o="urn:schemas-microsoft-com:office:office" xmlns:v="urn:schemas-microsoft-com:vml" xmlns:w10="urn:schemas-microsoft-com:office:word" xmlns:w="http://schemas.openxmlformats.org/wordprocessingml/2006/main" xmlns:w14="http://schemas.microsoft.com/office/word/2010/wordml" xmlns:w15="http://schemas.microsoft.com/office/word/2012/wordml" xmlns:w16cex="http://schemas.microsoft.com/office/word/2018/wordml/cex" xmlns:w16cid="http://schemas.microsoft.com/office/word/2016/wordml/cid" xmlns:w16="http://schemas.microsoft.com/office/word/2018/wordml" xmlns:w16sdtdh="http://schemas.microsoft.com/office/word/2020/wordml/sdtdatahash" xmlns:w16sdtfl="http://schemas.microsoft.com/office/word/2024/wordml/sdtformatlock" xmlns:w16se="http://schemas.microsoft.com/office/word/2015/wordml/symex" xmlns:w16du="http://schemas.microsoft.com/office/word/2023/wordml/word16du" xmlns:wne="http://schemas.microsoft.com/office/word/2006/wordml" mc:Ignorable="w14 w15 w16se w16cid w16 w16cex w16sdtdh w16sdtfl w16du wp14">
   <w:abstractNum w:abstractNumId="0" w15:restartNumberingAfterBreak="0">
     <w:nsid w:val="4DAC16F3"/>
     <w:multiLevelType w:val="hybridMultilevel"/>
@@ -955,12 +1021,12 @@
 </file>
 
 <file path=word/styles.xml><?xml version="1.0" encoding="utf-8"?>
-<w:styles xmlns:mc="http://schemas.openxmlformats.org/markup-compatibility/2006" xmlns:r="http://schemas.openxmlformats.org/officeDocument/2006/relationships" xmlns:w="http://schemas.openxmlformats.org/wordprocessingml/2006/main" xmlns:w14="http://schemas.microsoft.com/office/word/2010/wordml" xmlns:w15="http://schemas.microsoft.com/office/word/2012/wordml" xmlns:w16cex="http://schemas.microsoft.com/office/word/2018/wordml/cex" xmlns:w16cid="http://schemas.microsoft.com/office/word/2016/wordml/cid" xmlns:w16="http://schemas.microsoft.com/office/word/2018/wordml" xmlns:w16du="http://schemas.microsoft.com/office/word/2023/wordml/word16du" xmlns:w16sdtdh="http://schemas.microsoft.com/office/word/2020/wordml/sdtdatahash" xmlns:w16sdtfl="http://schemas.microsoft.com/office/word/2024/wordml/sdtformatlock" xmlns:w16se="http://schemas.microsoft.com/office/word/2015/wordml/symex" mc:Ignorable="w14 w15 w16se w16cid w16 w16cex w16sdtdh w16sdtfl w16du">
+<w:styles xmlns:mc="http://schemas.openxmlformats.org/markup-compatibility/2006" xmlns:r="http://schemas.openxmlformats.org/officeDocument/2006/relationships" xmlns:w="http://schemas.openxmlformats.org/wordprocessingml/2006/main" xmlns:w14="http://schemas.microsoft.com/office/word/2010/wordml" xmlns:w15="http://schemas.microsoft.com/office/word/2012/wordml" xmlns:w16cex="http://schemas.microsoft.com/office/word/2018/wordml/cex" xmlns:w16cid="http://schemas.microsoft.com/office/word/2016/wordml/cid" xmlns:w16="http://schemas.microsoft.com/office/word/2018/wordml" xmlns:w16sdtdh="http://schemas.microsoft.com/office/word/2020/wordml/sdtdatahash" xmlns:w16sdtfl="http://schemas.microsoft.com/office/word/2024/wordml/sdtformatlock" xmlns:w16se="http://schemas.microsoft.com/office/word/2015/wordml/symex" xmlns:w16du="http://schemas.microsoft.com/office/word/2023/wordml/word16du" mc:Ignorable="w14 w15 w16se w16cid w16 w16cex w16sdtdh w16sdtfl w16du">
   <w:docDefaults>
     <w:rPrDefault>
       <w:rPr>
         <w:rFonts w:ascii="Times New Roman" w:eastAsia="Times New Roman" w:hAnsi="Times New Roman" w:cs="Times New Roman"/>
-        <w:lang w:val="en-GR" w:eastAsia="en-GB" w:bidi="ar-SA"/>
+        <w:lang w:eastAsia="en-GB" w:bidi="ar-SA"/>
       </w:rPr>
     </w:rPrDefault>
     <w:pPrDefault/>

</xml_diff>